<commit_message>
chore: comprehensive AEO, SEO, and portfolio content updates
</commit_message>
<xml_diff>
--- a/Madhu Dadi_Resume.docx
+++ b/Madhu Dadi_Resume.docx
@@ -162,7 +162,7 @@
           <w:color w:val="111827"/>
           <w:sz w:val="20"/>
         </w:rPr>
-        <w:t>Builds LLM/RAG applications, agentic workflows, KPI frameworks, Marketing Mix Models, dashboards, and full-stack analytics products that connect business decisions to measurable outcomes.</w:t>
+        <w:t>Builds Generative AI and RAG (Retrieval-Augmented Generation) applications, Agentic AI/LLM orchestration workflows, KPI frameworks, MMM, and Next.js &amp; FastAPI analytics products tied to measurable outcomes.</w:t>
       </w:r>
     </w:p>
     <w:p>
@@ -234,7 +234,22 @@
           <w:color w:val="111827"/>
           <w:sz w:val="20"/>
         </w:rPr>
-        <w:t>Implemented data-driven frameworks across multi-channel digital platforms, driving a 15% increase in patient enrollment.</w:t>
+        <w:t xml:space="preserve">Implemented data-driven frameworks across multi-channel digital platforms, driving a </w:t>
+      </w:r>
+      <w:r>
+        <w:rPr>
+          <w:b/>
+          <w:color w:val="111827"/>
+          <w:sz w:val="20"/>
+        </w:rPr>
+        <w:t>15% increase in patient enrollment</w:t>
+      </w:r>
+      <w:r>
+        <w:rPr>
+          <w:color w:val="111827"/>
+          <w:sz w:val="20"/>
+        </w:rPr>
+        <w:t>.</w:t>
       </w:r>
     </w:p>
     <w:p>
@@ -248,7 +263,37 @@
           <w:color w:val="111827"/>
           <w:sz w:val="20"/>
         </w:rPr>
-        <w:t>Architected KPI measurement frameworks that transitioned 90% of patients to digital enrollments and reduced Turnaround Time (TAT) from several days to under 3 hours.</w:t>
+        <w:t xml:space="preserve">Architected KPI measurement frameworks that transitioned </w:t>
+      </w:r>
+      <w:r>
+        <w:rPr>
+          <w:b/>
+          <w:color w:val="111827"/>
+          <w:sz w:val="20"/>
+        </w:rPr>
+        <w:t>90% of patients to digital enrollments</w:t>
+      </w:r>
+      <w:r>
+        <w:rPr>
+          <w:color w:val="111827"/>
+          <w:sz w:val="20"/>
+        </w:rPr>
+        <w:t xml:space="preserve"> and reduced Turnaround Time (TAT) from several days to </w:t>
+      </w:r>
+      <w:r>
+        <w:rPr>
+          <w:b/>
+          <w:color w:val="111827"/>
+          <w:sz w:val="20"/>
+        </w:rPr>
+        <w:t>under 3 hours</w:t>
+      </w:r>
+      <w:r>
+        <w:rPr>
+          <w:color w:val="111827"/>
+          <w:sz w:val="20"/>
+        </w:rPr>
+        <w:t>.</w:t>
       </w:r>
     </w:p>
     <w:p>
@@ -262,7 +307,29 @@
           <w:color w:val="111827"/>
           <w:sz w:val="20"/>
         </w:rPr>
-        <w:t>Engineered enterprise-wide patient flows that accelerated digital asset launches from 3 months to 2 weeks.</w:t>
+        <w:t xml:space="preserve">Engineered enterprise-wide patient flows that accelerated </w:t>
+      </w:r>
+      <w:r>
+        <w:rPr>
+          <w:color w:val="111827"/>
+          <w:sz w:val="20"/>
+        </w:rPr>
+        <w:t xml:space="preserve">digital asset launches from </w:t>
+      </w:r>
+      <w:r>
+        <w:rPr>
+          <w:b/>
+          <w:color w:val="111827"/>
+          <w:sz w:val="20"/>
+        </w:rPr>
+        <w:t>3 months to 2 weeks</w:t>
+      </w:r>
+      <w:r>
+        <w:rPr>
+          <w:color w:val="111827"/>
+          <w:sz w:val="20"/>
+        </w:rPr>
+        <w:t>.</w:t>
       </w:r>
     </w:p>
     <w:p>
@@ -276,7 +343,21 @@
           <w:color w:val="111827"/>
           <w:sz w:val="20"/>
         </w:rPr>
-        <w:t>Won 2 internal AI Hackathons by developing Model Context Protocols (MCPs) and advanced Marketing Mix Models (MMM) for marketing spend optimization.</w:t>
+        <w:t xml:space="preserve">Won </w:t>
+      </w:r>
+      <w:r>
+        <w:rPr>
+          <w:color w:val="111827"/>
+          <w:sz w:val="20"/>
+        </w:rPr>
+        <w:t>2 internal AI Hackathons</w:t>
+      </w:r>
+      <w:r>
+        <w:rPr>
+          <w:color w:val="111827"/>
+          <w:sz w:val="20"/>
+        </w:rPr>
+        <w:t xml:space="preserve"> by developing Model Context Protocols (MCPs) and advanced Marketing Mix Models (MMM) for marketing spend optimization.</w:t>
       </w:r>
     </w:p>
     <w:p>
@@ -290,7 +371,21 @@
           <w:color w:val="111827"/>
           <w:sz w:val="20"/>
         </w:rPr>
-        <w:t>Directed end-to-end analytics lifecycles, maintaining a 4.9/5 patient satisfaction score through optimized enrollment and adherence communication programs.</w:t>
+        <w:t xml:space="preserve">Directed end-to-end analytics lifecycles, maintaining a </w:t>
+      </w:r>
+      <w:r>
+        <w:rPr>
+          <w:color w:val="111827"/>
+          <w:sz w:val="20"/>
+        </w:rPr>
+        <w:t>4.9/5 patient satisfaction score</w:t>
+      </w:r>
+      <w:r>
+        <w:rPr>
+          <w:color w:val="111827"/>
+          <w:sz w:val="20"/>
+        </w:rPr>
+        <w:t xml:space="preserve"> through optimized enrollment and adherence communication programs.</w:t>
       </w:r>
     </w:p>
     <w:p>
@@ -304,7 +399,28 @@
           <w:color w:val="111827"/>
           <w:sz w:val="20"/>
         </w:rPr>
-        <w:t>Delivered strategic analytical insights to senior leadership and integrated AI-driven marketing strategies, improving operational efficiency by 25%.</w:t>
+        <w:t xml:space="preserve">Delivered strategic analytical insights to senior leadership and integrated AI-driven marketing strategies, </w:t>
+      </w:r>
+      <w:r>
+        <w:rPr>
+          <w:color w:val="111827"/>
+          <w:sz w:val="20"/>
+        </w:rPr>
+        <w:t xml:space="preserve">improving </w:t>
+      </w:r>
+      <w:r>
+        <w:rPr>
+          <w:color w:val="111827"/>
+          <w:sz w:val="20"/>
+        </w:rPr>
+        <w:t>operational efficiency by 25%</w:t>
+      </w:r>
+      <w:r>
+        <w:rPr>
+          <w:color w:val="111827"/>
+          <w:sz w:val="20"/>
+        </w:rPr>
+        <w:t>.</w:t>
       </w:r>
     </w:p>
     <w:p>
@@ -359,7 +475,22 @@
           <w:color w:val="111827"/>
           <w:sz w:val="20"/>
         </w:rPr>
-        <w:t>Received Best Performer of the Quarter (Q3 Trailblazer) for a campaign strategy that drove 30% growth in new customer acquisition.</w:t>
+        <w:t xml:space="preserve">Received Best Performer of the Quarter (Q3 Trailblazer) for a campaign strategy that drove </w:t>
+      </w:r>
+      <w:r>
+        <w:rPr>
+          <w:b/>
+          <w:color w:val="111827"/>
+          <w:sz w:val="20"/>
+        </w:rPr>
+        <w:t>30% growth in new customer acquisition</w:t>
+      </w:r>
+      <w:r>
+        <w:rPr>
+          <w:color w:val="111827"/>
+          <w:sz w:val="20"/>
+        </w:rPr>
+        <w:t>.</w:t>
       </w:r>
     </w:p>
     <w:p>
@@ -387,7 +518,29 @@
           <w:color w:val="111827"/>
           <w:sz w:val="20"/>
         </w:rPr>
-        <w:t>Strategized and executed CLM campaigns across Email, WhatsApp, and SMS, reducing customer churn by 20%.</w:t>
+        <w:t xml:space="preserve">Strategized and executed CLM campaigns across Email, WhatsApp, and SMS, </w:t>
+      </w:r>
+      <w:r>
+        <w:rPr>
+          <w:color w:val="111827"/>
+          <w:sz w:val="20"/>
+        </w:rPr>
+        <w:t xml:space="preserve">reducing </w:t>
+      </w:r>
+      <w:r>
+        <w:rPr>
+          <w:b/>
+          <w:color w:val="111827"/>
+          <w:sz w:val="20"/>
+        </w:rPr>
+        <w:t>customer churn by 20%</w:t>
+      </w:r>
+      <w:r>
+        <w:rPr>
+          <w:color w:val="111827"/>
+          <w:sz w:val="20"/>
+        </w:rPr>
+        <w:t>.</w:t>
       </w:r>
     </w:p>
     <w:p>
@@ -414,7 +567,19 @@
         <w:rPr>
           <w:sz w:val="20"/>
         </w:rPr>
-        <w:t>Delivered brand campaign impact analysis across India, Malaysia, Indonesia, and Singapore, helping increase brand awareness by 15%.</w:t>
+        <w:t xml:space="preserve">Delivered brand campaign impact analysis across India, Malaysia, Indonesia, and Singapore, helping </w:t>
+      </w:r>
+      <w:r>
+        <w:rPr>
+          <w:sz w:val="20"/>
+        </w:rPr>
+        <w:t>increase brand awareness by 15%</w:t>
+      </w:r>
+      <w:r>
+        <w:rPr>
+          <w:sz w:val="20"/>
+        </w:rPr>
+        <w:t>.</w:t>
       </w:r>
     </w:p>
     <w:p>
@@ -456,7 +621,21 @@
           <w:color w:val="111827"/>
           <w:sz w:val="20"/>
         </w:rPr>
-        <w:t>Spearheaded Google Ads Data Hub projects across GroupM agencies, serving the top 5% of global clients.</w:t>
+        <w:t xml:space="preserve">Spearheaded Google Ads Data Hub projects across GroupM agencies, serving the </w:t>
+      </w:r>
+      <w:r>
+        <w:rPr>
+          <w:color w:val="111827"/>
+          <w:sz w:val="20"/>
+        </w:rPr>
+        <w:t>top 5% of global clients</w:t>
+      </w:r>
+      <w:r>
+        <w:rPr>
+          <w:color w:val="111827"/>
+          <w:sz w:val="20"/>
+        </w:rPr>
+        <w:t>.</w:t>
       </w:r>
     </w:p>
     <w:p>
@@ -669,7 +848,22 @@
           <w:color w:val="111827"/>
           <w:sz w:val="19"/>
         </w:rPr>
-        <w:t>Designed parallel Playwright headless crawls that process 10,000+ pages per audit and compare server HTML with rendered DOM.</w:t>
+        <w:t xml:space="preserve">Designed parallel Playwright headless crawls that process </w:t>
+      </w:r>
+      <w:r>
+        <w:rPr>
+          <w:b/>
+          <w:color w:val="111827"/>
+          <w:sz w:val="19"/>
+        </w:rPr>
+        <w:t>10,000+ pages per audit</w:t>
+      </w:r>
+      <w:r>
+        <w:rPr>
+          <w:color w:val="111827"/>
+          <w:sz w:val="19"/>
+        </w:rPr>
+        <w:t xml:space="preserve"> and compare server HTML with rendered DOM.</w:t>
       </w:r>
     </w:p>
     <w:p>
@@ -683,7 +877,22 @@
           <w:color w:val="111827"/>
           <w:sz w:val="19"/>
         </w:rPr>
-        <w:t>Implemented a FastAPI + Celery backend with Redis, PostgreSQL, and 18 parallel audit analyzers for severity-prioritized fix queues.</w:t>
+        <w:t xml:space="preserve">Implemented a FastAPI + Celery backend with Redis, PostgreSQL, and </w:t>
+      </w:r>
+      <w:r>
+        <w:rPr>
+          <w:b/>
+          <w:color w:val="111827"/>
+          <w:sz w:val="19"/>
+        </w:rPr>
+        <w:t>18 parallel audit analyzers</w:t>
+      </w:r>
+      <w:r>
+        <w:rPr>
+          <w:color w:val="111827"/>
+          <w:sz w:val="19"/>
+        </w:rPr>
+        <w:t xml:space="preserve"> for severity-prioritized fix queues.</w:t>
       </w:r>
     </w:p>
     <w:p>
@@ -697,7 +906,29 @@
           <w:color w:val="111827"/>
           <w:sz w:val="19"/>
         </w:rPr>
-        <w:t>Audits robots.txt, sitemaps, structured data schemas, and llms.txt configurations, reducing technical audit cycle time by 85%.</w:t>
+        <w:t xml:space="preserve">Audits robots.txt, sitemaps, structured data schemas, and llms.txt configurations, </w:t>
+      </w:r>
+      <w:r>
+        <w:rPr>
+          <w:color w:val="111827"/>
+          <w:sz w:val="19"/>
+        </w:rPr>
+        <w:t xml:space="preserve">reducing technical audit cycle time by </w:t>
+      </w:r>
+      <w:r>
+        <w:rPr>
+          <w:b/>
+          <w:color w:val="111827"/>
+          <w:sz w:val="19"/>
+        </w:rPr>
+        <w:t>85%</w:t>
+      </w:r>
+      <w:r>
+        <w:rPr>
+          <w:color w:val="111827"/>
+          <w:sz w:val="19"/>
+        </w:rPr>
+        <w:t>.</w:t>
       </w:r>
     </w:p>
     <w:p>
@@ -770,7 +1001,21 @@
           <w:color w:val="111827"/>
           <w:sz w:val="19"/>
         </w:rPr>
-        <w:t>Integrated an AI Q&amp;A assistant powered by LangChain and RAG, achieving sub-second response times for complex AI queries.</w:t>
+        <w:t xml:space="preserve">Integrated an AI Q&amp;A assistant powered by LangChain and RAG, achieving </w:t>
+      </w:r>
+      <w:r>
+        <w:rPr>
+          <w:color w:val="111827"/>
+          <w:sz w:val="19"/>
+        </w:rPr>
+        <w:t>sub-second response times</w:t>
+      </w:r>
+      <w:r>
+        <w:rPr>
+          <w:color w:val="111827"/>
+          <w:sz w:val="19"/>
+        </w:rPr>
+        <w:t xml:space="preserve"> for complex AI queries.</w:t>
       </w:r>
     </w:p>
     <w:p>
@@ -784,7 +1029,21 @@
           <w:color w:val="111827"/>
           <w:sz w:val="19"/>
         </w:rPr>
-        <w:t>Optimized the Next.js frontend to 95+ Lighthouse scores for speed and accessibility, contributing to a 20% increase in user engagement.</w:t>
+        <w:t xml:space="preserve">Optimized the Next.js frontend to </w:t>
+      </w:r>
+      <w:r>
+        <w:rPr>
+          <w:color w:val="111827"/>
+          <w:sz w:val="19"/>
+        </w:rPr>
+        <w:t>95+ Lighthouse scores</w:t>
+      </w:r>
+      <w:r>
+        <w:rPr>
+          <w:color w:val="111827"/>
+          <w:sz w:val="19"/>
+        </w:rPr>
+        <w:t xml:space="preserve"> for speed and accessibility, contributing to a 20% increase in user engagement.</w:t>
       </w:r>
     </w:p>
     <w:p>
@@ -825,7 +1084,22 @@
           <w:color w:val="111827"/>
           <w:sz w:val="19"/>
         </w:rPr>
-        <w:t>Engineered asynchronous task queues and Redis-backed workers to handle 100+ workflow requests per minute with controlled concurrency.</w:t>
+        <w:t xml:space="preserve">Engineered asynchronous task queues and Redis-backed workers to handle </w:t>
+      </w:r>
+      <w:r>
+        <w:rPr>
+          <w:b/>
+          <w:color w:val="111827"/>
+          <w:sz w:val="19"/>
+        </w:rPr>
+        <w:t>100+ workflow requests per minute</w:t>
+      </w:r>
+      <w:r>
+        <w:rPr>
+          <w:color w:val="111827"/>
+          <w:sz w:val="19"/>
+        </w:rPr>
+        <w:t xml:space="preserve"> with controlled concurrency.</w:t>
       </w:r>
     </w:p>
     <w:p>
@@ -917,7 +1191,7 @@
                 <w:color w:val="111827"/>
                 <w:sz w:val="18"/>
               </w:rPr>
-              <w:t>Agentic AI, RAG, LangChain, MCPs, Machine Learning, Deep Learning, NLP, MLOps, DevOps</w:t>
+              <w:t>Generative AI, RAG, Agentic AI, LLM Orchestration, LangChain, MCPs, Machine/Deep Learning, NLP, MLOps, DevOps</w:t>
             </w:r>
           </w:p>
         </w:tc>

</xml_diff>

<commit_message>
fix: resolve markdown bold parsing in case studies and update GroupM to GroupM (WPP)
</commit_message>
<xml_diff>
--- a/Madhu Dadi_Resume.docx
+++ b/Madhu Dadi_Resume.docx
@@ -1056,8 +1056,40 @@
           <w:color w:val="0B2545"/>
           <w:sz w:val="20"/>
         </w:rPr>
-        <w:t>Udemy Enroller | FastAPI Browser-Workflow Automation | January 2026 - Present</w:t>
+        <w:t>Udemy Enroller</w:t>
       </w:r>
+      <w:r>
+        <w:rPr>
+          <w:b/>
+          <w:color w:val="111827"/>
+          <w:sz w:val="20"/>
+        </w:rPr>
+        <w:t xml:space="preserve"> | FastAPI Browser-Workflow Automation</w:t>
+      </w:r>
+      <w:r>
+        <w:rPr>
+          <w:color w:val="4B5563"/>
+          <w:sz w:val="20"/>
+        </w:rPr>
+        <w:t xml:space="preserve"> | January 2026 - Present</w:t>
+      </w:r>
+      <w:r>
+        <w:rPr>
+          <w:color w:val="2563EB"/>
+          <w:sz w:val="20"/>
+        </w:rPr>
+        <w:t xml:space="preserve"> | </w:t>
+      </w:r>
+      <w:hyperlink r:id="rId13" w:history="1">
+        <w:r>
+          <w:rPr>
+            <w:color w:val="0563C1"/>
+            <w:sz w:val="20"/>
+            <w:u w:val="single"/>
+          </w:rPr>
+          <w:t>udemyenroller.madhudadi.in</w:t>
+        </w:r>
+      </w:hyperlink>
     </w:p>
     <w:p>
       <w:pPr>
@@ -13492,6 +13524,29 @@
       </w:tcPr>
     </w:tblStylePr>
   </w:style>
+  <w:style w:type="character" w:styleId="Hyperlink">
+    <w:name w:val="Hyperlink"/>
+    <w:basedOn w:val="DefaultParagraphFont"/>
+    <w:uiPriority w:val="99"/>
+    <w:unhideWhenUsed/>
+    <w:rsid w:val="00902B46"/>
+    <w:rPr>
+      <w:color w:val="0000FF" w:themeColor="hyperlink"/>
+      <w:u w:val="single"/>
+    </w:rPr>
+  </w:style>
+  <w:style w:type="character" w:styleId="UnresolvedMention">
+    <w:name w:val="Unresolved Mention"/>
+    <w:basedOn w:val="DefaultParagraphFont"/>
+    <w:uiPriority w:val="99"/>
+    <w:semiHidden/>
+    <w:unhideWhenUsed/>
+    <w:rsid w:val="00902B46"/>
+    <w:rPr>
+      <w:color w:val="605E5C"/>
+      <w:shd w:val="clear" w:color="auto" w:fill="E1DFDD"/>
+    </w:rPr>
+  </w:style>
 </w:styles>
 </file>
 

</xml_diff>